<commit_message>
Add learner start guide and map QR code
</commit_message>
<xml_diff>
--- a/materialien/holzforscher-mappe.docx
+++ b/materialien/holzforscher-mappe.docx
@@ -46,16 +46,102 @@
         <w:t>Die Mappe ist dein Arbeitsort. Die Website zeigt dir den nächsten Schritt. Schreibe und zeichne deine Ergebnisse auf diese Blätter.</w:t>
       </w:r>
     </w:p>
-    <w:p>
-      <w:r>
-        <w:t>Öffne auf deinem iPad:</w:t>
-      </w:r>
-    </w:p>
-    <w:p>
-      <w:r>
-        <w:t>https://wp7ur1-holz.vercel.app/lernweg.html</w:t>
-      </w:r>
-    </w:p>
+    <w:tbl>
+      <w:tblPr>
+        <w:tblW w:type="dxa" w:w="9638"/>
+        <w:jc w:val="left"/>
+        <w:tblLayout w:type="fixed"/>
+        <w:tblLook w:firstColumn="1" w:firstRow="1" w:lastColumn="0" w:lastRow="0" w:noHBand="0" w:noVBand="1" w:val="04A0"/>
+        <w:tblInd w:type="dxa" w:w="120"/>
+      </w:tblPr>
+      <w:tblGrid>
+        <w:gridCol w:w="6803"/>
+        <w:gridCol w:w="2835"/>
+      </w:tblGrid>
+      <w:tr>
+        <w:trPr/>
+        <w:tc>
+          <w:tcPr>
+            <w:tcW w:type="dxa" w:w="6803"/>
+            <w:tcMar>
+              <w:top w:w="80" w:type="dxa"/>
+              <w:bottom w:w="80" w:type="dxa"/>
+              <w:start w:w="120" w:type="dxa"/>
+              <w:end w:w="120" w:type="dxa"/>
+            </w:tcMar>
+          </w:tcPr>
+          <w:p>
+            <w:r>
+              <w:rPr>
+                <w:b/>
+              </w:rPr>
+              <w:t>Öffne deinen Lernweg auf dem iPad.</w:t>
+              <w:br/>
+            </w:r>
+            <w:r>
+              <w:t>Scanne den QR-Code oder öffne:</w:t>
+              <w:br/>
+            </w:r>
+            <w:r>
+              <w:rPr>
+                <w:sz w:val="20"/>
+              </w:rPr>
+              <w:t>https://wp7ur1-holz.vercel.app/lernweg.html</w:t>
+            </w:r>
+          </w:p>
+        </w:tc>
+        <w:tc>
+          <w:tcPr>
+            <w:tcW w:type="dxa" w:w="2835"/>
+            <w:tcMar>
+              <w:top w:w="80" w:type="dxa"/>
+              <w:bottom w:w="80" w:type="dxa"/>
+              <w:start w:w="120" w:type="dxa"/>
+              <w:end w:w="120" w:type="dxa"/>
+            </w:tcMar>
+          </w:tcPr>
+          <w:p>
+            <w:pPr>
+              <w:jc w:val="center"/>
+            </w:pPr>
+            <w:r>
+              <w:drawing>
+                <wp:inline xmlns:a="http://schemas.openxmlformats.org/drawingml/2006/main" xmlns:pic="http://schemas.openxmlformats.org/drawingml/2006/picture">
+                  <wp:extent cx="1224000" cy="1224000"/>
+                  <wp:docPr id="1" name="Picture 1"/>
+                  <wp:cNvGraphicFramePr>
+                    <a:graphicFrameLocks noChangeAspect="1"/>
+                  </wp:cNvGraphicFramePr>
+                  <a:graphic>
+                    <a:graphicData uri="http://schemas.openxmlformats.org/drawingml/2006/picture">
+                      <pic:pic>
+                        <pic:nvPicPr>
+                          <pic:cNvPr id="0" name="lernweg-qr.png"/>
+                          <pic:cNvPicPr/>
+                        </pic:nvPicPr>
+                        <pic:blipFill>
+                          <a:blip r:embed="rId11"/>
+                          <a:stretch>
+                            <a:fillRect/>
+                          </a:stretch>
+                        </pic:blipFill>
+                        <pic:spPr>
+                          <a:xfrm>
+                            <a:off x="0" y="0"/>
+                            <a:ext cx="1224000" cy="1224000"/>
+                          </a:xfrm>
+                          <a:prstGeom prst="rect"/>
+                        </pic:spPr>
+                      </pic:pic>
+                    </a:graphicData>
+                  </a:graphic>
+                </wp:inline>
+              </w:drawing>
+            </w:r>
+          </w:p>
+        </w:tc>
+      </w:tr>
+    </w:tbl>
     <w:p>
       <w:pPr>
         <w:pStyle w:val="Heading2"/>
@@ -1552,7 +1638,7 @@
         <w:drawing>
           <wp:inline xmlns:a="http://schemas.openxmlformats.org/drawingml/2006/main" xmlns:pic="http://schemas.openxmlformats.org/drawingml/2006/picture">
             <wp:extent cx="6120000" cy="3060000"/>
-            <wp:docPr id="1" name="Picture 1"/>
+            <wp:docPr id="2" name="Picture 2"/>
             <wp:cNvGraphicFramePr>
               <a:graphicFrameLocks noChangeAspect="1"/>
             </wp:cNvGraphicFramePr>
@@ -1564,7 +1650,7 @@
                     <pic:cNvPicPr/>
                   </pic:nvPicPr>
                   <pic:blipFill>
-                    <a:blip r:embed="rId11"/>
+                    <a:blip r:embed="rId12"/>
                     <a:stretch>
                       <a:fillRect/>
                     </a:stretch>

</xml_diff>